<commit_message>
Update WI-Pengoperasian-QualiSync-Quality-Development document with new content
</commit_message>
<xml_diff>
--- a/docs/WI-Pengoperasian-QualiSync-Quality-Development.docx
+++ b/docs/WI-Pengoperasian-QualiSync-Quality-Development.docx
@@ -1,6 +1,6 @@
 
 <file path=word/document.xml><?xml version="1.0" encoding="utf-8"?>
-<w:document xmlns:w="http://schemas.openxmlformats.org/wordprocessingml/2006/main" xmlns:r="http://schemas.openxmlformats.org/officeDocument/2006/relationships">
+<w:document xmlns:ns1="http://schemas.openxmlformats.org/officeDocument/2006/relationships" xmlns:w="http://schemas.openxmlformats.org/wordprocessingml/2006/main">
   <w:body>
     <w:tbl>
       <w:tblPr>
@@ -3111,9 +3111,1465 @@
         <w:t xml:space="preserve">Akhir dokumen</w:t>
       </w:r>
     </w:p>
+    <w:p>
+      <w:pPr>
+        <w:pStyle w:val="Heading2"/>
+        <w:pageBreakBefore/>
+        <w:spacing w:after="100" w:line="260" w:lineRule="auto"/>
+      </w:pPr>
+      <w:r>
+        <w:rPr>
+          <w:b/>
+          <w:color w:val="17365D"/>
+          <w:sz w:val="28"/>
+        </w:rPr>
+        <w:t xml:space="preserve">LAMPIRAN A - WI OTORISASI PENGOPERASIAN QUALISYNC</w:t>
+      </w:r>
+    </w:p>
+    <w:p>
+      <w:pPr>
+        <w:spacing w:after="100" w:line="260" w:lineRule="auto"/>
+      </w:pPr>
+      <w:r>
+        <w:rPr>
+          <w:color w:val="64748B"/>
+          <w:sz w:val="18"/>
+        </w:rPr>
+        <w:t xml:space="preserve">No. Dokumen: [diisi Doc Control]    Revisi: 00    Tanggal berlaku: [diisi setelah persetujuan]</w:t>
+      </w:r>
+    </w:p>
+    <w:p>
+      <w:pPr>
+        <w:spacing w:after="100" w:line="260" w:lineRule="auto"/>
+      </w:pPr>
+      <w:r>
+        <w:rPr>
+          <w:b/>
+          <w:color w:val="9A6700"/>
+          <w:sz w:val="18"/>
+        </w:rPr>
+        <w:t xml:space="preserve">Status: DRAF untuk ditinjau dan disahkan oleh Kepala Departemen/Manajemen yang berwenang.</w:t>
+      </w:r>
+    </w:p>
+    <w:p>
+      <w:pPr>
+        <w:pStyle w:val="Heading2"/>
+        <w:spacing w:after="100" w:line="260" w:lineRule="auto"/>
+      </w:pPr>
+      <w:r>
+        <w:rPr>
+          <w:b/>
+          <w:color w:val="17365D"/>
+          <w:sz w:val="23"/>
+        </w:rPr>
+        <w:t xml:space="preserve">1. Tujuan dan ruang lingkup</w:t>
+      </w:r>
+    </w:p>
+    <w:p>
+      <w:pPr>
+        <w:spacing w:after="100" w:line="260" w:lineRule="auto"/>
+      </w:pPr>
+      <w:r>
+        <w:rPr>
+          <w:color w:val="1F2937"/>
+          <w:sz w:val="20"/>
+        </w:rPr>
+        <w:t xml:space="preserve">Menetapkan tata cara pemberian, penggunaan, pemisahan, peninjauan, dan pencabutan kewenangan pengguna pada menu QualiSync dalam ruang lingkup Quality dan Development. Lampiran ini melengkapi WI pengoperasian; matriks final harus disahkan sesuai struktur organisasi dan matriks otorisasi resmi perusahaan.</w:t>
+      </w:r>
+    </w:p>
+    <w:p>
+      <w:pPr>
+        <w:pStyle w:val="Heading2"/>
+        <w:spacing w:after="100" w:line="260" w:lineRule="auto"/>
+      </w:pPr>
+      <w:r>
+        <w:rPr>
+          <w:b/>
+          <w:color w:val="17365D"/>
+          <w:sz w:val="23"/>
+        </w:rPr>
+        <w:t xml:space="preserve">2. Prinsip otorisasi</w:t>
+      </w:r>
+    </w:p>
+    <w:p>
+      <w:pPr>
+        <w:spacing w:after="100" w:line="260" w:lineRule="auto"/>
+      </w:pPr>
+      <w:r>
+        <w:rPr>
+          <w:color w:val="1F2937"/>
+          <w:sz w:val="19"/>
+        </w:rPr>
+        <w:t xml:space="preserve">1. Akses diberikan kepada akun individu sesuai tugas dan tanggung jawab yang disetujui atasan; akun dan kata sandi tidak boleh dipinjamkan atau digunakan bersama.</w:t>
+      </w:r>
+    </w:p>
+    <w:p>
+      <w:pPr>
+        <w:spacing w:after="100" w:line="260" w:lineRule="auto"/>
+      </w:pPr>
+      <w:r>
+        <w:rPr>
+          <w:color w:val="1F2937"/>
+          <w:sz w:val="19"/>
+        </w:rPr>
+        <w:t xml:space="preserve">2. Pelaksana transaksi menginput berdasarkan bukti sumber dan memeriksa ulang data sebelum menyimpan.</w:t>
+      </w:r>
+    </w:p>
+    <w:p>
+      <w:pPr>
+        <w:spacing w:after="100" w:line="260" w:lineRule="auto"/>
+      </w:pPr>
+      <w:r>
+        <w:rPr>
+          <w:color w:val="1F2937"/>
+          <w:sz w:val="19"/>
+        </w:rPr>
+        <w:t xml:space="preserve">3. Persetujuan keputusan penting dilakukan oleh personel yang ditunjuk dan, bila memungkinkan, berbeda dari pembuat transaksi (maker-checker). Pembuat tidak boleh menyetujui transaksi miliknya sendiri kecuali pengecualian tertulis telah disahkan.</w:t>
+      </w:r>
+    </w:p>
+    <w:p>
+      <w:pPr>
+        <w:spacing w:after="100" w:line="260" w:lineRule="auto"/>
+      </w:pPr>
+      <w:r>
+        <w:rPr>
+          <w:color w:val="1F2937"/>
+          <w:sz w:val="19"/>
+        </w:rPr>
+        <w:t xml:space="preserve">4. Hak admin sistem adalah kewenangan teknis untuk pengelolaan akun/dukungan, bukan persetujuan otomatis atas keputusan mutu atau transaksi.</w:t>
+      </w:r>
+    </w:p>
+    <w:p>
+      <w:pPr>
+        <w:spacing w:after="100" w:line="260" w:lineRule="auto"/>
+      </w:pPr>
+      <w:r>
+        <w:rPr>
+          <w:color w:val="1F2937"/>
+          <w:sz w:val="19"/>
+        </w:rPr>
+        <w:t xml:space="preserve">5. Perubahan master yang memengaruhi pemeriksaan atau identitas material harus memiliki dasar dokumen terkendali, peninjauan pemilik proses, dan persetujuan pejabat yang ditunjuk sebelum digunakan.</w:t>
+      </w:r>
+    </w:p>
+    <w:p>
+      <w:pPr>
+        <w:pStyle w:val="Heading2"/>
+        <w:spacing w:after="100" w:line="260" w:lineRule="auto"/>
+      </w:pPr>
+      <w:r>
+        <w:rPr>
+          <w:b/>
+          <w:color w:val="17365D"/>
+          <w:sz w:val="23"/>
+        </w:rPr>
+        <w:t xml:space="preserve">3. Peran dan tanggung jawab (matriks usulan)</w:t>
+      </w:r>
+    </w:p>
+    <w:tbl>
+      <w:tblPr>
+        <w:tblW w:w="0" w:type="auto"/>
+        <w:tblBorders>
+          <w:top w:val="single" w:sz="5" w:color="AAB7B8"/>
+          <w:left w:val="single" w:sz="5" w:color="AAB7B8"/>
+          <w:bottom w:val="single" w:sz="5" w:color="AAB7B8"/>
+          <w:right w:val="single" w:sz="5" w:color="AAB7B8"/>
+          <w:insideH w:val="single" w:sz="5" w:color="AAB7B8"/>
+          <w:insideV w:val="single" w:sz="5" w:color="AAB7B8"/>
+        </w:tblBorders>
+      </w:tblPr>
+      <w:tblGrid>
+        <w:gridCol w:w="2100"/>
+        <w:gridCol w:w="3900"/>
+        <w:gridCol w:w="3900"/>
+      </w:tblGrid>
+      <w:tr>
+        <w:tc>
+          <w:tcPr>
+            <w:tcW w:w="2100" w:type="dxa"/>
+            <w:shd w:fill="DCE6F1"/>
+          </w:tcPr>
+          <w:p>
+            <w:pPr>
+              <w:spacing w:after="60" w:line="230" w:lineRule="auto"/>
+            </w:pPr>
+            <w:r>
+              <w:rPr>
+                <w:b/>
+                <w:sz w:val="16"/>
+              </w:rPr>
+              <w:t xml:space="preserve">Peran</w:t>
+            </w:r>
+          </w:p>
+        </w:tc>
+        <w:tc>
+          <w:tcPr>
+            <w:tcW w:w="3900" w:type="dxa"/>
+            <w:shd w:fill="DCE6F1"/>
+          </w:tcPr>
+          <w:p>
+            <w:pPr>
+              <w:spacing w:after="60" w:line="230" w:lineRule="auto"/>
+            </w:pPr>
+            <w:r>
+              <w:rPr>
+                <w:b/>
+                <w:sz w:val="16"/>
+              </w:rPr>
+              <w:t xml:space="preserve">Tanggung jawab utama</w:t>
+            </w:r>
+          </w:p>
+        </w:tc>
+        <w:tc>
+          <w:tcPr>
+            <w:tcW w:w="3900" w:type="dxa"/>
+            <w:shd w:fill="DCE6F1"/>
+          </w:tcPr>
+          <w:p>
+            <w:pPr>
+              <w:spacing w:after="60" w:line="230" w:lineRule="auto"/>
+            </w:pPr>
+            <w:r>
+              <w:rPr>
+                <w:b/>
+                <w:sz w:val="16"/>
+              </w:rPr>
+              <w:t xml:space="preserve">Batas kewenangan</w:t>
+            </w:r>
+          </w:p>
+        </w:tc>
+      </w:tr>
+      <w:tr>
+        <w:tc>
+          <w:tcPr>
+            <w:tcW w:w="2100" w:type="dxa"/>
+          </w:tcPr>
+          <w:p>
+            <w:pPr>
+              <w:spacing w:after="60" w:line="230" w:lineRule="auto"/>
+            </w:pPr>
+            <w:r>
+              <w:rPr>
+                <w:sz w:val="16"/>
+              </w:rPr>
+              <w:t xml:space="preserve">Operator Quality / QC</w:t>
+            </w:r>
+          </w:p>
+        </w:tc>
+        <w:tc>
+          <w:tcPr>
+            <w:tcW w:w="3900" w:type="dxa"/>
+          </w:tcPr>
+          <w:p>
+            <w:pPr>
+              <w:spacing w:after="60" w:line="230" w:lineRule="auto"/>
+            </w:pPr>
+            <w:r>
+              <w:rPr>
+                <w:sz w:val="16"/>
+              </w:rPr>
+              <w:t xml:space="preserve">Menjalankan pemeriksaan dan mencatat hasil sesuai instruksi kerja; mengajukan transaksi yang diperlukan.</w:t>
+            </w:r>
+          </w:p>
+        </w:tc>
+        <w:tc>
+          <w:tcPr>
+            <w:tcW w:w="3900" w:type="dxa"/>
+          </w:tcPr>
+          <w:p>
+            <w:pPr>
+              <w:spacing w:after="60" w:line="230" w:lineRule="auto"/>
+            </w:pPr>
+            <w:r>
+              <w:rPr>
+                <w:sz w:val="16"/>
+              </w:rPr>
+              <w:t xml:space="preserve">Tidak menetapkan/menyetujui standar atau keputusan di luar penugasan. Approval atas input sendiri tidak diperkenankan sebagai aturan proses.</w:t>
+            </w:r>
+          </w:p>
+        </w:tc>
+      </w:tr>
+      <w:tr>
+        <w:tc>
+          <w:tcPr>
+            <w:tcW w:w="2100" w:type="dxa"/>
+          </w:tcPr>
+          <w:p>
+            <w:pPr>
+              <w:spacing w:after="60" w:line="230" w:lineRule="auto"/>
+            </w:pPr>
+            <w:r>
+              <w:rPr>
+                <w:sz w:val="16"/>
+              </w:rPr>
+              <w:t xml:space="preserve">Staff Quality / PIC Quality</w:t>
+            </w:r>
+          </w:p>
+        </w:tc>
+        <w:tc>
+          <w:tcPr>
+            <w:tcW w:w="3900" w:type="dxa"/>
+          </w:tcPr>
+          <w:p>
+            <w:pPr>
+              <w:spacing w:after="60" w:line="230" w:lineRule="auto"/>
+            </w:pPr>
+            <w:r>
+              <w:rPr>
+                <w:sz w:val="16"/>
+              </w:rPr>
+              <w:t xml:space="preserve">Meninjau kelengkapan dan konsistensi catatan; menangani verifikasi/approval Quality bila ditunjuk.</w:t>
+            </w:r>
+          </w:p>
+        </w:tc>
+        <w:tc>
+          <w:tcPr>
+            <w:tcW w:w="3900" w:type="dxa"/>
+          </w:tcPr>
+          <w:p>
+            <w:pPr>
+              <w:spacing w:after="60" w:line="230" w:lineRule="auto"/>
+            </w:pPr>
+            <w:r>
+              <w:rPr>
+                <w:sz w:val="16"/>
+              </w:rPr>
+              <w:t xml:space="preserve">Keputusan Incoming, Traceability, Mutasi, COA, dan CAPA hanya dalam lingkup delegasi tertulis.</w:t>
+            </w:r>
+          </w:p>
+        </w:tc>
+      </w:tr>
+      <w:tr>
+        <w:tc>
+          <w:tcPr>
+            <w:tcW w:w="2100" w:type="dxa"/>
+          </w:tcPr>
+          <w:p>
+            <w:pPr>
+              <w:spacing w:after="60" w:line="230" w:lineRule="auto"/>
+            </w:pPr>
+            <w:r>
+              <w:rPr>
+                <w:sz w:val="16"/>
+              </w:rPr>
+              <w:t xml:space="preserve">Kepala Departemen Quality / approver yang ditunjuk</w:t>
+            </w:r>
+          </w:p>
+        </w:tc>
+        <w:tc>
+          <w:tcPr>
+            <w:tcW w:w="3900" w:type="dxa"/>
+          </w:tcPr>
+          <w:p>
+            <w:pPr>
+              <w:spacing w:after="60" w:line="230" w:lineRule="auto"/>
+            </w:pPr>
+            <w:r>
+              <w:rPr>
+                <w:sz w:val="16"/>
+              </w:rPr>
+              <w:t xml:space="preserve">Mengesahkan standar mutu, perubahan master, pelepasan/pengecualian, dan keputusan berisiko sesuai matriks perusahaan.</w:t>
+            </w:r>
+          </w:p>
+        </w:tc>
+        <w:tc>
+          <w:tcPr>
+            <w:tcW w:w="3900" w:type="dxa"/>
+          </w:tcPr>
+          <w:p>
+            <w:pPr>
+              <w:spacing w:after="60" w:line="230" w:lineRule="auto"/>
+            </w:pPr>
+            <w:r>
+              <w:rPr>
+                <w:sz w:val="16"/>
+              </w:rPr>
+              <w:t xml:space="preserve">Batas nilai/jenis keputusan, pengganti, dan eskalasi mengikuti matriks otorisasi perusahaan.</w:t>
+            </w:r>
+          </w:p>
+        </w:tc>
+      </w:tr>
+      <w:tr>
+        <w:tc>
+          <w:tcPr>
+            <w:tcW w:w="2100" w:type="dxa"/>
+          </w:tcPr>
+          <w:p>
+            <w:pPr>
+              <w:spacing w:after="60" w:line="230" w:lineRule="auto"/>
+            </w:pPr>
+            <w:r>
+              <w:rPr>
+                <w:sz w:val="16"/>
+              </w:rPr>
+              <w:t xml:space="preserve">PIC Master Material Development</w:t>
+            </w:r>
+          </w:p>
+        </w:tc>
+        <w:tc>
+          <w:tcPr>
+            <w:tcW w:w="3900" w:type="dxa"/>
+          </w:tcPr>
+          <w:p>
+            <w:pPr>
+              <w:spacing w:after="60" w:line="230" w:lineRule="auto"/>
+            </w:pPr>
+            <w:r>
+              <w:rPr>
+                <w:sz w:val="16"/>
+              </w:rPr>
+              <w:t xml:space="preserve">Mengelola pembuatan/perubahan No. MM, nama, kategori, dan satuan berdasarkan dokumen resmi.</w:t>
+            </w:r>
+          </w:p>
+        </w:tc>
+        <w:tc>
+          <w:tcPr>
+            <w:tcW w:w="3900" w:type="dxa"/>
+          </w:tcPr>
+          <w:p>
+            <w:pPr>
+              <w:spacing w:after="60" w:line="230" w:lineRule="auto"/>
+            </w:pPr>
+            <w:r>
+              <w:rPr>
+                <w:sz w:val="16"/>
+              </w:rPr>
+              <w:t xml:space="preserve">Tidak mengubah hasil inspeksi atau standar Quality; perubahan yang berdampak pada Quality harus dikomunikasikan dan ditinjau pemilik Quality.</w:t>
+            </w:r>
+          </w:p>
+        </w:tc>
+      </w:tr>
+      <w:tr>
+        <w:tc>
+          <w:tcPr>
+            <w:tcW w:w="2100" w:type="dxa"/>
+          </w:tcPr>
+          <w:p>
+            <w:pPr>
+              <w:spacing w:after="60" w:line="230" w:lineRule="auto"/>
+            </w:pPr>
+            <w:r>
+              <w:rPr>
+                <w:sz w:val="16"/>
+              </w:rPr>
+              <w:t xml:space="preserve">Admin Sistem</w:t>
+            </w:r>
+          </w:p>
+        </w:tc>
+        <w:tc>
+          <w:tcPr>
+            <w:tcW w:w="3900" w:type="dxa"/>
+          </w:tcPr>
+          <w:p>
+            <w:pPr>
+              <w:spacing w:after="60" w:line="230" w:lineRule="auto"/>
+            </w:pPr>
+            <w:r>
+              <w:rPr>
+                <w:sz w:val="16"/>
+              </w:rPr>
+              <w:t xml:space="preserve">Membuat, mengubah, menonaktifkan akun/role setelah menerima persetujuan; membantu kendala teknis.</w:t>
+            </w:r>
+          </w:p>
+        </w:tc>
+        <w:tc>
+          <w:tcPr>
+            <w:tcW w:w="3900" w:type="dxa"/>
+          </w:tcPr>
+          <w:p>
+            <w:pPr>
+              <w:spacing w:after="60" w:line="230" w:lineRule="auto"/>
+            </w:pPr>
+            <w:r>
+              <w:rPr>
+                <w:sz w:val="16"/>
+              </w:rPr>
+              <w:t xml:space="preserve">Tidak menggunakan akses teknis untuk membuat atau mengesahkan data operasional tanpa penugasan terpisah.</w:t>
+            </w:r>
+          </w:p>
+        </w:tc>
+      </w:tr>
+      <w:tr>
+        <w:tc>
+          <w:tcPr>
+            <w:tcW w:w="2100" w:type="dxa"/>
+          </w:tcPr>
+          <w:p>
+            <w:pPr>
+              <w:spacing w:after="60" w:line="230" w:lineRule="auto"/>
+            </w:pPr>
+            <w:r>
+              <w:rPr>
+                <w:sz w:val="16"/>
+              </w:rPr>
+              <w:t xml:space="preserve">Supplier (bila diberi akun)</w:t>
+            </w:r>
+          </w:p>
+        </w:tc>
+        <w:tc>
+          <w:tcPr>
+            <w:tcW w:w="3900" w:type="dxa"/>
+          </w:tcPr>
+          <w:p>
+            <w:pPr>
+              <w:spacing w:after="60" w:line="230" w:lineRule="auto"/>
+            </w:pPr>
+            <w:r>
+              <w:rPr>
+                <w:sz w:val="16"/>
+              </w:rPr>
+              <w:t xml:space="preserve">Mengisi jawaban/tindakan CAPA Supplier yang ditugaskan dan mengirimkan bukti.</w:t>
+            </w:r>
+          </w:p>
+        </w:tc>
+        <w:tc>
+          <w:tcPr>
+            <w:tcW w:w="3900" w:type="dxa"/>
+          </w:tcPr>
+          <w:p>
+            <w:pPr>
+              <w:spacing w:after="60" w:line="230" w:lineRule="auto"/>
+            </w:pPr>
+            <w:r>
+              <w:rPr>
+                <w:sz w:val="16"/>
+              </w:rPr>
+              <w:t xml:space="preserve">Tidak berwenang menyetujui hasil QC, COA, atau transaksi internal perusahaan.</w:t>
+            </w:r>
+          </w:p>
+        </w:tc>
+      </w:tr>
+    </w:tbl>
+    <w:p>
+      <w:pPr>
+        <w:pStyle w:val="Heading2"/>
+        <w:spacing w:after="100" w:line="260" w:lineRule="auto"/>
+      </w:pPr>
+      <w:r>
+        <w:rPr>
+          <w:b/>
+          <w:color w:val="17365D"/>
+          <w:sz w:val="23"/>
+        </w:rPr>
+        <w:t xml:space="preserve">4. Matriks otorisasi transaksi (usulan untuk disahkan)</w:t>
+      </w:r>
+    </w:p>
+    <w:tbl>
+      <w:tblPr>
+        <w:tblW w:w="0" w:type="auto"/>
+        <w:tblBorders>
+          <w:top w:val="single" w:sz="5" w:color="AAB7B8"/>
+          <w:left w:val="single" w:sz="5" w:color="AAB7B8"/>
+          <w:bottom w:val="single" w:sz="5" w:color="AAB7B8"/>
+          <w:right w:val="single" w:sz="5" w:color="AAB7B8"/>
+          <w:insideH w:val="single" w:sz="5" w:color="AAB7B8"/>
+          <w:insideV w:val="single" w:sz="5" w:color="AAB7B8"/>
+        </w:tblBorders>
+      </w:tblPr>
+      <w:tblGrid>
+        <w:gridCol w:w="2200"/>
+        <w:gridCol w:w="2600"/>
+        <w:gridCol w:w="2700"/>
+        <w:gridCol w:w="2400"/>
+      </w:tblGrid>
+      <w:tr>
+        <w:tc>
+          <w:tcPr>
+            <w:tcW w:w="2200" w:type="dxa"/>
+            <w:shd w:fill="DCE6F1"/>
+          </w:tcPr>
+          <w:p>
+            <w:pPr>
+              <w:spacing w:after="60" w:line="230" w:lineRule="auto"/>
+            </w:pPr>
+            <w:r>
+              <w:rPr>
+                <w:b/>
+                <w:sz w:val="16"/>
+              </w:rPr>
+              <w:t xml:space="preserve">Aktivitas/menu</w:t>
+            </w:r>
+          </w:p>
+        </w:tc>
+        <w:tc>
+          <w:tcPr>
+            <w:tcW w:w="2600" w:type="dxa"/>
+            <w:shd w:fill="DCE6F1"/>
+          </w:tcPr>
+          <w:p>
+            <w:pPr>
+              <w:spacing w:after="60" w:line="230" w:lineRule="auto"/>
+            </w:pPr>
+            <w:r>
+              <w:rPr>
+                <w:b/>
+                <w:sz w:val="16"/>
+              </w:rPr>
+              <w:t xml:space="preserve">Pelaksana (maker)</w:t>
+            </w:r>
+          </w:p>
+        </w:tc>
+        <w:tc>
+          <w:tcPr>
+            <w:tcW w:w="2700" w:type="dxa"/>
+            <w:shd w:fill="DCE6F1"/>
+          </w:tcPr>
+          <w:p>
+            <w:pPr>
+              <w:spacing w:after="60" w:line="230" w:lineRule="auto"/>
+            </w:pPr>
+            <w:r>
+              <w:rPr>
+                <w:b/>
+                <w:sz w:val="16"/>
+              </w:rPr>
+              <w:t xml:space="preserve">Pemeriksa/approver</w:t>
+            </w:r>
+          </w:p>
+        </w:tc>
+        <w:tc>
+          <w:tcPr>
+            <w:tcW w:w="2400" w:type="dxa"/>
+            <w:shd w:fill="DCE6F1"/>
+          </w:tcPr>
+          <w:p>
+            <w:pPr>
+              <w:spacing w:after="60" w:line="230" w:lineRule="auto"/>
+            </w:pPr>
+            <w:r>
+              <w:rPr>
+                <w:b/>
+                <w:sz w:val="16"/>
+              </w:rPr>
+              <w:t xml:space="preserve">Catatan kontrol</w:t>
+            </w:r>
+          </w:p>
+        </w:tc>
+      </w:tr>
+      <w:tr>
+        <w:tc>
+          <w:tcPr>
+            <w:tcW w:w="2200" w:type="dxa"/>
+          </w:tcPr>
+          <w:p>
+            <w:pPr>
+              <w:spacing w:after="60" w:line="230" w:lineRule="auto"/>
+            </w:pPr>
+            <w:r>
+              <w:rPr>
+                <w:sz w:val="16"/>
+              </w:rPr>
+              <w:t xml:space="preserve">Incoming Material</w:t>
+            </w:r>
+          </w:p>
+        </w:tc>
+        <w:tc>
+          <w:tcPr>
+            <w:tcW w:w="2600" w:type="dxa"/>
+          </w:tcPr>
+          <w:p>
+            <w:pPr>
+              <w:spacing w:after="60" w:line="230" w:lineRule="auto"/>
+            </w:pPr>
+            <w:r>
+              <w:rPr>
+                <w:sz w:val="16"/>
+              </w:rPr>
+              <w:t xml:space="preserve">Petugas Quality/QC yang ditugaskan memeriksa dan menginput hasil.</w:t>
+            </w:r>
+          </w:p>
+        </w:tc>
+        <w:tc>
+          <w:tcPr>
+            <w:tcW w:w="2700" w:type="dxa"/>
+          </w:tcPr>
+          <w:p>
+            <w:pPr>
+              <w:spacing w:after="60" w:line="230" w:lineRule="auto"/>
+            </w:pPr>
+            <w:r>
+              <w:rPr>
+                <w:sz w:val="16"/>
+              </w:rPr>
+              <w:t xml:space="preserve">Staff Quality/approver yang ditunjuk; tetapkan siapa yang boleh menetapkan status final.</w:t>
+            </w:r>
+          </w:p>
+        </w:tc>
+        <w:tc>
+          <w:tcPr>
+            <w:tcW w:w="2400" w:type="dxa"/>
+          </w:tcPr>
+          <w:p>
+            <w:pPr>
+              <w:spacing w:after="60" w:line="230" w:lineRule="auto"/>
+            </w:pPr>
+            <w:r>
+              <w:rPr>
+                <w:sz w:val="16"/>
+              </w:rPr>
+              <w:t xml:space="preserve">Cocokkan No. MM, batch, kuantitas Pass/Hold/NG dan bukti inspeksi.</w:t>
+            </w:r>
+          </w:p>
+        </w:tc>
+      </w:tr>
+      <w:tr>
+        <w:tc>
+          <w:tcPr>
+            <w:tcW w:w="2200" w:type="dxa"/>
+          </w:tcPr>
+          <w:p>
+            <w:pPr>
+              <w:spacing w:after="60" w:line="230" w:lineRule="auto"/>
+            </w:pPr>
+            <w:r>
+              <w:rPr>
+                <w:sz w:val="16"/>
+              </w:rPr>
+              <w:t xml:space="preserve">QIR dan Inspeksi FG</w:t>
+            </w:r>
+          </w:p>
+        </w:tc>
+        <w:tc>
+          <w:tcPr>
+            <w:tcW w:w="2600" w:type="dxa"/>
+          </w:tcPr>
+          <w:p>
+            <w:pPr>
+              <w:spacing w:after="60" w:line="230" w:lineRule="auto"/>
+            </w:pPr>
+            <w:r>
+              <w:rPr>
+                <w:sz w:val="16"/>
+              </w:rPr>
+              <w:t xml:space="preserve">Operator Quality/QC yang melakukan inspeksi.</w:t>
+            </w:r>
+          </w:p>
+        </w:tc>
+        <w:tc>
+          <w:tcPr>
+            <w:tcW w:w="2700" w:type="dxa"/>
+          </w:tcPr>
+          <w:p>
+            <w:pPr>
+              <w:spacing w:after="60" w:line="230" w:lineRule="auto"/>
+            </w:pPr>
+            <w:r>
+              <w:rPr>
+                <w:sz w:val="16"/>
+              </w:rPr>
+              <w:t xml:space="preserve">Reviewer Quality yang ditunjuk untuk tinjauan/pelepasan bila proses mensyaratkan approval.</w:t>
+            </w:r>
+          </w:p>
+        </w:tc>
+        <w:tc>
+          <w:tcPr>
+            <w:tcW w:w="2400" w:type="dxa"/>
+          </w:tcPr>
+          <w:p>
+            <w:pPr>
+              <w:spacing w:after="60" w:line="230" w:lineRule="auto"/>
+            </w:pPr>
+            <w:r>
+              <w:rPr>
+                <w:sz w:val="16"/>
+              </w:rPr>
+              <w:t xml:space="preserve">Hasil pengukuran harus dapat ditelusuri ke sampel, batch, standar, dan petugas.</w:t>
+            </w:r>
+          </w:p>
+        </w:tc>
+      </w:tr>
+      <w:tr>
+        <w:tc>
+          <w:tcPr>
+            <w:tcW w:w="2200" w:type="dxa"/>
+          </w:tcPr>
+          <w:p>
+            <w:pPr>
+              <w:spacing w:after="60" w:line="230" w:lineRule="auto"/>
+            </w:pPr>
+            <w:r>
+              <w:rPr>
+                <w:sz w:val="16"/>
+              </w:rPr>
+              <w:t xml:space="preserve">Approval Traceability</w:t>
+            </w:r>
+          </w:p>
+        </w:tc>
+        <w:tc>
+          <w:tcPr>
+            <w:tcW w:w="2600" w:type="dxa"/>
+          </w:tcPr>
+          <w:p>
+            <w:pPr>
+              <w:spacing w:after="60" w:line="230" w:lineRule="auto"/>
+            </w:pPr>
+            <w:r>
+              <w:rPr>
+                <w:sz w:val="16"/>
+              </w:rPr>
+              <w:t xml:space="preserve">Produksi mengirim catatan; Quality memeriksa.</w:t>
+            </w:r>
+          </w:p>
+        </w:tc>
+        <w:tc>
+          <w:tcPr>
+            <w:tcW w:w="2700" w:type="dxa"/>
+          </w:tcPr>
+          <w:p>
+            <w:pPr>
+              <w:spacing w:after="60" w:line="230" w:lineRule="auto"/>
+            </w:pPr>
+            <w:r>
+              <w:rPr>
+                <w:sz w:val="16"/>
+              </w:rPr>
+              <w:t xml:space="preserve">PIC Quality yang ditunjuk dan bukan pembuat catatan sumber.</w:t>
+            </w:r>
+          </w:p>
+        </w:tc>
+        <w:tc>
+          <w:tcPr>
+            <w:tcW w:w="2400" w:type="dxa"/>
+          </w:tcPr>
+          <w:p>
+            <w:pPr>
+              <w:spacing w:after="60" w:line="230" w:lineRule="auto"/>
+            </w:pPr>
+            <w:r>
+              <w:rPr>
+                <w:sz w:val="16"/>
+              </w:rPr>
+              <w:t xml:space="preserve">Setujui hanya setelah WO, material, batch, operator, dan shift cocok.</w:t>
+            </w:r>
+          </w:p>
+        </w:tc>
+      </w:tr>
+      <w:tr>
+        <w:tc>
+          <w:tcPr>
+            <w:tcW w:w="2200" w:type="dxa"/>
+          </w:tcPr>
+          <w:p>
+            <w:pPr>
+              <w:spacing w:after="60" w:line="230" w:lineRule="auto"/>
+            </w:pPr>
+            <w:r>
+              <w:rPr>
+                <w:sz w:val="16"/>
+              </w:rPr>
+              <w:t xml:space="preserve">Mutasi Stok dan Approval Mutasi</w:t>
+            </w:r>
+          </w:p>
+        </w:tc>
+        <w:tc>
+          <w:tcPr>
+            <w:tcW w:w="2600" w:type="dxa"/>
+          </w:tcPr>
+          <w:p>
+            <w:pPr>
+              <w:spacing w:after="60" w:line="230" w:lineRule="auto"/>
+            </w:pPr>
+            <w:r>
+              <w:rPr>
+                <w:sz w:val="16"/>
+              </w:rPr>
+              <w:t xml:space="preserve">Pemohon/petugas stok mengajukan; identitas pemohon dicatat.</w:t>
+            </w:r>
+          </w:p>
+        </w:tc>
+        <w:tc>
+          <w:tcPr>
+            <w:tcW w:w="2700" w:type="dxa"/>
+          </w:tcPr>
+          <w:p>
+            <w:pPr>
+              <w:spacing w:after="60" w:line="230" w:lineRule="auto"/>
+            </w:pPr>
+            <w:r>
+              <w:rPr>
+                <w:sz w:val="16"/>
+              </w:rPr>
+              <w:t xml:space="preserve">Approver Quality/departemen tujuan sesuai jenis perpindahan dan matriks perusahaan.</w:t>
+            </w:r>
+          </w:p>
+        </w:tc>
+        <w:tc>
+          <w:tcPr>
+            <w:tcW w:w="2400" w:type="dxa"/>
+          </w:tcPr>
+          <w:p>
+            <w:pPr>
+              <w:spacing w:after="60" w:line="230" w:lineRule="auto"/>
+            </w:pPr>
+            <w:r>
+              <w:rPr>
+                <w:sz w:val="16"/>
+              </w:rPr>
+              <w:t xml:space="preserve">Pihak yang memutuskan harus memeriksa stok, tujuan, batch, dan kuantitas.</w:t>
+            </w:r>
+          </w:p>
+        </w:tc>
+      </w:tr>
+      <w:tr>
+        <w:tc>
+          <w:tcPr>
+            <w:tcW w:w="2200" w:type="dxa"/>
+          </w:tcPr>
+          <w:p>
+            <w:pPr>
+              <w:spacing w:after="60" w:line="230" w:lineRule="auto"/>
+            </w:pPr>
+            <w:r>
+              <w:rPr>
+                <w:sz w:val="16"/>
+              </w:rPr>
+              <w:t xml:space="preserve">COA Manager</w:t>
+            </w:r>
+          </w:p>
+        </w:tc>
+        <w:tc>
+          <w:tcPr>
+            <w:tcW w:w="2600" w:type="dxa"/>
+          </w:tcPr>
+          <w:p>
+            <w:pPr>
+              <w:spacing w:after="60" w:line="230" w:lineRule="auto"/>
+            </w:pPr>
+            <w:r>
+              <w:rPr>
+                <w:sz w:val="16"/>
+              </w:rPr>
+              <w:t xml:space="preserve">PIC Quality menyiapkan COA dari data batch/QIR tervalidasi.</w:t>
+            </w:r>
+          </w:p>
+        </w:tc>
+        <w:tc>
+          <w:tcPr>
+            <w:tcW w:w="2700" w:type="dxa"/>
+          </w:tcPr>
+          <w:p>
+            <w:pPr>
+              <w:spacing w:after="60" w:line="230" w:lineRule="auto"/>
+            </w:pPr>
+            <w:r>
+              <w:rPr>
+                <w:sz w:val="16"/>
+              </w:rPr>
+              <w:t xml:space="preserve">Pemeriksa/penyetuju COA sesuai daftar penandatangan yang disahkan.</w:t>
+            </w:r>
+          </w:p>
+        </w:tc>
+        <w:tc>
+          <w:tcPr>
+            <w:tcW w:w="2400" w:type="dxa"/>
+          </w:tcPr>
+          <w:p>
+            <w:pPr>
+              <w:spacing w:after="60" w:line="230" w:lineRule="auto"/>
+            </w:pPr>
+            <w:r>
+              <w:rPr>
+                <w:sz w:val="16"/>
+              </w:rPr>
+              <w:t xml:space="preserve">Nama pada COA harus sesuai penugasan; jangan menerbitkan hasil belum diverifikasi.</w:t>
+            </w:r>
+          </w:p>
+        </w:tc>
+      </w:tr>
+      <w:tr>
+        <w:tc>
+          <w:tcPr>
+            <w:tcW w:w="2200" w:type="dxa"/>
+          </w:tcPr>
+          <w:p>
+            <w:pPr>
+              <w:spacing w:after="60" w:line="230" w:lineRule="auto"/>
+            </w:pPr>
+            <w:r>
+              <w:rPr>
+                <w:sz w:val="16"/>
+              </w:rPr>
+              <w:t xml:space="preserve">CAPA Customer/Supplier</w:t>
+            </w:r>
+          </w:p>
+        </w:tc>
+        <w:tc>
+          <w:tcPr>
+            <w:tcW w:w="2600" w:type="dxa"/>
+          </w:tcPr>
+          <w:p>
+            <w:pPr>
+              <w:spacing w:after="60" w:line="230" w:lineRule="auto"/>
+            </w:pPr>
+            <w:r>
+              <w:rPr>
+                <w:sz w:val="16"/>
+              </w:rPr>
+              <w:t xml:space="preserve">PIC Quality membuat dan mengoordinasikan tindak lanjut.</w:t>
+            </w:r>
+          </w:p>
+        </w:tc>
+        <w:tc>
+          <w:tcPr>
+            <w:tcW w:w="2700" w:type="dxa"/>
+          </w:tcPr>
+          <w:p>
+            <w:pPr>
+              <w:spacing w:after="60" w:line="230" w:lineRule="auto"/>
+            </w:pPr>
+            <w:r>
+              <w:rPr>
+                <w:sz w:val="16"/>
+              </w:rPr>
+              <w:t xml:space="preserve">Kepala/PIC Quality yang ditunjuk meninjau jawaban dan penutupan; supplier hanya mengirim respons.</w:t>
+            </w:r>
+          </w:p>
+        </w:tc>
+        <w:tc>
+          <w:tcPr>
+            <w:tcW w:w="2400" w:type="dxa"/>
+          </w:tcPr>
+          <w:p>
+            <w:pPr>
+              <w:spacing w:after="60" w:line="230" w:lineRule="auto"/>
+            </w:pPr>
+            <w:r>
+              <w:rPr>
+                <w:sz w:val="16"/>
+              </w:rPr>
+              <w:t xml:space="preserve">Kriteria penutupan dan verifikasi efektivitas harus ditetapkan pemilik proses.</w:t>
+            </w:r>
+          </w:p>
+        </w:tc>
+      </w:tr>
+      <w:tr>
+        <w:tc>
+          <w:tcPr>
+            <w:tcW w:w="2200" w:type="dxa"/>
+          </w:tcPr>
+          <w:p>
+            <w:pPr>
+              <w:spacing w:after="60" w:line="230" w:lineRule="auto"/>
+            </w:pPr>
+            <w:r>
+              <w:rPr>
+                <w:sz w:val="16"/>
+              </w:rPr>
+              <w:t xml:space="preserve">Master Standar QIR, Parameter, AQL, Defect</w:t>
+            </w:r>
+          </w:p>
+        </w:tc>
+        <w:tc>
+          <w:tcPr>
+            <w:tcW w:w="2600" w:type="dxa"/>
+          </w:tcPr>
+          <w:p>
+            <w:pPr>
+              <w:spacing w:after="60" w:line="230" w:lineRule="auto"/>
+            </w:pPr>
+            <w:r>
+              <w:rPr>
+                <w:sz w:val="16"/>
+              </w:rPr>
+              <w:t xml:space="preserve">PIC Master Quality mengajukan/memasukkan perubahan.</w:t>
+            </w:r>
+          </w:p>
+        </w:tc>
+        <w:tc>
+          <w:tcPr>
+            <w:tcW w:w="2700" w:type="dxa"/>
+          </w:tcPr>
+          <w:p>
+            <w:pPr>
+              <w:spacing w:after="60" w:line="230" w:lineRule="auto"/>
+            </w:pPr>
+            <w:r>
+              <w:rPr>
+                <w:sz w:val="16"/>
+              </w:rPr>
+              <w:t xml:space="preserve">Pemilik proses Quality/approver teknis yang ditunjuk.</w:t>
+            </w:r>
+          </w:p>
+        </w:tc>
+        <w:tc>
+          <w:tcPr>
+            <w:tcW w:w="2400" w:type="dxa"/>
+          </w:tcPr>
+          <w:p>
+            <w:pPr>
+              <w:spacing w:after="60" w:line="230" w:lineRule="auto"/>
+            </w:pPr>
+            <w:r>
+              <w:rPr>
+                <w:sz w:val="16"/>
+              </w:rPr>
+              <w:t xml:space="preserve">Simpan referensi spesifikasi, persetujuan, tanggal efektif, dan bukti perubahan.</w:t>
+            </w:r>
+          </w:p>
+        </w:tc>
+      </w:tr>
+      <w:tr>
+        <w:tc>
+          <w:tcPr>
+            <w:tcW w:w="2200" w:type="dxa"/>
+          </w:tcPr>
+          <w:p>
+            <w:pPr>
+              <w:spacing w:after="60" w:line="230" w:lineRule="auto"/>
+            </w:pPr>
+            <w:r>
+              <w:rPr>
+                <w:sz w:val="16"/>
+              </w:rPr>
+              <w:t xml:space="preserve">Master Material (MM)</w:t>
+            </w:r>
+          </w:p>
+        </w:tc>
+        <w:tc>
+          <w:tcPr>
+            <w:tcW w:w="2600" w:type="dxa"/>
+          </w:tcPr>
+          <w:p>
+            <w:pPr>
+              <w:spacing w:after="60" w:line="230" w:lineRule="auto"/>
+            </w:pPr>
+            <w:r>
+              <w:rPr>
+                <w:sz w:val="16"/>
+              </w:rPr>
+              <w:t xml:space="preserve">PIC Master Material Development membuat/mengubah data.</w:t>
+            </w:r>
+          </w:p>
+        </w:tc>
+        <w:tc>
+          <w:tcPr>
+            <w:tcW w:w="2700" w:type="dxa"/>
+          </w:tcPr>
+          <w:p>
+            <w:pPr>
+              <w:spacing w:after="60" w:line="230" w:lineRule="auto"/>
+            </w:pPr>
+            <w:r>
+              <w:rPr>
+                <w:sz w:val="16"/>
+              </w:rPr>
+              <w:t xml:space="preserve">Atasan/pemilik data Development; Quality meninjau atribut yang memengaruhi pemeriksaan.</w:t>
+            </w:r>
+          </w:p>
+        </w:tc>
+        <w:tc>
+          <w:tcPr>
+            <w:tcW w:w="2400" w:type="dxa"/>
+          </w:tcPr>
+          <w:p>
+            <w:pPr>
+              <w:spacing w:after="60" w:line="230" w:lineRule="auto"/>
+            </w:pPr>
+            <w:r>
+              <w:rPr>
+                <w:sz w:val="16"/>
+              </w:rPr>
+              <w:t xml:space="preserve">No. MM harus unik dan konsisten; penghapusan perlu pemeriksaan keterkaitan transaksi.</w:t>
+            </w:r>
+          </w:p>
+        </w:tc>
+      </w:tr>
+    </w:tbl>
+    <w:p>
+      <w:pPr>
+        <w:pStyle w:val="Heading2"/>
+        <w:spacing w:after="100" w:line="260" w:lineRule="auto"/>
+      </w:pPr>
+      <w:r>
+        <w:rPr>
+          <w:b/>
+          <w:color w:val="17365D"/>
+          <w:sz w:val="23"/>
+        </w:rPr>
+        <w:t xml:space="preserve">5. Prosedur pemberian dan pencabutan akses</w:t>
+      </w:r>
+    </w:p>
+    <w:p>
+      <w:pPr>
+        <w:spacing w:after="100" w:line="260" w:lineRule="auto"/>
+      </w:pPr>
+      <w:r>
+        <w:rPr>
+          <w:color w:val="1F2937"/>
+          <w:sz w:val="19"/>
+        </w:rPr>
+        <w:t xml:space="preserve">1. Atasan mengajukan akses/perubahan role dengan mencantumkan nama, departemen, jabatan, menu yang diperlukan, alasan, dan masa berlaku bila sementara.</w:t>
+      </w:r>
+    </w:p>
+    <w:p>
+      <w:pPr>
+        <w:spacing w:after="100" w:line="260" w:lineRule="auto"/>
+      </w:pPr>
+      <w:r>
+        <w:rPr>
+          <w:color w:val="1F2937"/>
+          <w:sz w:val="19"/>
+        </w:rPr>
+        <w:t xml:space="preserve">2. Kepala departemen/pemilik proses meninjau kesesuaian akses dengan tugas dan matriks otorisasi; persetujuan dicatat sebelum admin memproses.</w:t>
+      </w:r>
+    </w:p>
+    <w:p>
+      <w:pPr>
+        <w:spacing w:after="100" w:line="260" w:lineRule="auto"/>
+      </w:pPr>
+      <w:r>
+        <w:rPr>
+          <w:color w:val="1F2937"/>
+          <w:sz w:val="19"/>
+        </w:rPr>
+        <w:t xml:space="preserve">3. Admin membuat atau mengubah akun sesuai persetujuan, memberikan kredensial secara aman, dan mencatat tanggal serta role yang diberikan.</w:t>
+      </w:r>
+    </w:p>
+    <w:p>
+      <w:pPr>
+        <w:spacing w:after="100" w:line="260" w:lineRule="auto"/>
+      </w:pPr>
+      <w:r>
+        <w:rPr>
+          <w:color w:val="1F2937"/>
+          <w:sz w:val="19"/>
+        </w:rPr>
+        <w:t xml:space="preserve">4. Pengguna memeriksa menu yang dapat diakses dan segera melapor bila hak akses berlebih/kurang. Jangan memakai akses untuk tugas di luar penunjukan.</w:t>
+      </w:r>
+    </w:p>
+    <w:p>
+      <w:pPr>
+        <w:spacing w:after="100" w:line="260" w:lineRule="auto"/>
+      </w:pPr>
+      <w:r>
+        <w:rPr>
+          <w:color w:val="1F2937"/>
+          <w:sz w:val="19"/>
+        </w:rPr>
+        <w:t xml:space="preserve">5. Atasan meminta perubahan atau pencabutan akses saat mutasi jabatan, perubahan tugas, cuti panjang yang relevan, atau hubungan kerja berakhir. Admin menonaktifkan akses dan mencatat penyelesaiannya.</w:t>
+      </w:r>
+    </w:p>
+    <w:p>
+      <w:pPr>
+        <w:spacing w:after="100" w:line="260" w:lineRule="auto"/>
+      </w:pPr>
+      <w:r>
+        <w:rPr>
+          <w:color w:val="1F2937"/>
+          <w:sz w:val="19"/>
+        </w:rPr>
+        <w:t xml:space="preserve">6. Atasan/pemilik proses meninjau daftar akses secara berkala sesuai kebijakan perusahaan dan setelah perubahan organisasi.</w:t>
+      </w:r>
+    </w:p>
+    <w:p>
+      <w:pPr>
+        <w:pStyle w:val="Heading2"/>
+        <w:spacing w:after="100" w:line="260" w:lineRule="auto"/>
+      </w:pPr>
+      <w:r>
+        <w:rPr>
+          <w:b/>
+          <w:color w:val="17365D"/>
+          <w:sz w:val="23"/>
+        </w:rPr>
+        <w:t xml:space="preserve">6. Ketentuan penting sebelum WI diberlakukan</w:t>
+      </w:r>
+    </w:p>
+    <w:p>
+      <w:pPr>
+        <w:spacing w:after="100" w:line="260" w:lineRule="auto"/>
+      </w:pPr>
+      <w:r>
+        <w:rPr>
+          <w:color w:val="1F2937"/>
+          <w:sz w:val="20"/>
+        </w:rPr>
+        <w:t xml:space="preserve">Role yang tampak pada aplikasi antara lain staff_quality, operator_quality, quality, development, supplier, dan admin. Rute portal Quality tertentu mengizinkan staff_quality/operator_quality/admin; CAPA dan beberapa fungsi lain menggunakan daftar role berbeda; Master Material Development dibatasi pada development/admin. Akses teknis tersebut tidak selalu sama dengan otorisasi bisnis dan beberapa fungsi Quality tidak menunjukkan pemisahan approver secara eksplisit. Karena itu, matriks pada dokumen ini adalah usulan tata kelola, bukan bukti bahwa aplikasi telah menegakkan seluruh pemisahan kewenangan.</w:t>
+      </w:r>
+    </w:p>
+    <w:p>
+      <w:pPr>
+        <w:spacing w:after="100" w:line="260" w:lineRule="auto"/>
+      </w:pPr>
+      <w:r>
+        <w:rPr>
+          <w:color w:val="1F2937"/>
+          <w:sz w:val="20"/>
+        </w:rPr>
+        <w:t xml:space="preserve">Sebelum penerbitan, perusahaan harus mengisi nama/jabatan approver, pengganti, batas keputusan, masa berlaku, dan aturan maker-checker; kemudian Admin Sistem memastikan konfigurasi role/menu/tindakan sesuai matriks yang disahkan. Jika sistem belum dapat memisahkan maker dan approver, gunakan pemeriksaan independen yang terdokumentasi dan rencanakan pembatasan teknis.</w:t>
+      </w:r>
+    </w:p>
+    <w:p>
+      <w:pPr>
+        <w:pStyle w:val="Heading2"/>
+        <w:spacing w:after="100" w:line="260" w:lineRule="auto"/>
+      </w:pPr>
+      <w:r>
+        <w:rPr>
+          <w:b/>
+          <w:color w:val="17365D"/>
+          <w:sz w:val="23"/>
+        </w:rPr>
+        <w:t xml:space="preserve">7. Rekaman otorisasi</w:t>
+      </w:r>
+    </w:p>
+    <w:p>
+      <w:pPr>
+        <w:spacing w:after="100" w:line="260" w:lineRule="auto"/>
+      </w:pPr>
+      <w:r>
+        <w:rPr>
+          <w:color w:val="1F2937"/>
+          <w:sz w:val="20"/>
+        </w:rPr>
+        <w:t xml:space="preserve">Simpan formulir permintaan/perubahan akses, bukti persetujuan, daftar role, catatan perubahan oleh Admin Sistem, hasil peninjauan berkala, dan bukti persetujuan transaksi sesuai masa simpan dokumen perusahaan.</w:t>
+      </w:r>
+    </w:p>
+    <w:p>
+      <w:pPr>
+        <w:pStyle w:val="Heading2"/>
+        <w:spacing w:after="100" w:line="260" w:lineRule="auto"/>
+      </w:pPr>
+      <w:r>
+        <w:rPr>
+          <w:b/>
+          <w:color w:val="17365D"/>
+          <w:sz w:val="23"/>
+        </w:rPr>
+        <w:t xml:space="preserve">8. Persetujuan WI Otorisasi</w:t>
+      </w:r>
+    </w:p>
+    <w:tbl>
+      <w:tblPr>
+        <w:tblW w:w="0" w:type="auto"/>
+        <w:tblBorders>
+          <w:top w:val="single" w:sz="5" w:color="AAB7B8"/>
+          <w:left w:val="single" w:sz="5" w:color="AAB7B8"/>
+          <w:bottom w:val="single" w:sz="5" w:color="AAB7B8"/>
+          <w:right w:val="single" w:sz="5" w:color="AAB7B8"/>
+          <w:insideH w:val="single" w:sz="5" w:color="AAB7B8"/>
+          <w:insideV w:val="single" w:sz="5" w:color="AAB7B8"/>
+        </w:tblBorders>
+      </w:tblPr>
+      <w:tblGrid>
+        <w:gridCol w:w="3260"/>
+        <w:gridCol w:w="3260"/>
+        <w:gridCol w:w="3260"/>
+      </w:tblGrid>
+      <w:tr>
+        <w:tc>
+          <w:tcPr>
+            <w:tcW w:w="3260" w:type="dxa"/>
+            <w:shd w:fill="DCE6F1"/>
+          </w:tcPr>
+          <w:p>
+            <w:pPr>
+              <w:spacing w:after="60" w:line="230" w:lineRule="auto"/>
+            </w:pPr>
+            <w:r>
+              <w:rPr>
+                <w:b/>
+                <w:sz w:val="16"/>
+              </w:rPr>
+              <w:t xml:space="preserve">Disusun oleh</w:t>
+            </w:r>
+          </w:p>
+        </w:tc>
+        <w:tc>
+          <w:tcPr>
+            <w:tcW w:w="3260" w:type="dxa"/>
+            <w:shd w:fill="DCE6F1"/>
+          </w:tcPr>
+          <w:p>
+            <w:pPr>
+              <w:spacing w:after="60" w:line="230" w:lineRule="auto"/>
+            </w:pPr>
+            <w:r>
+              <w:rPr>
+                <w:b/>
+                <w:sz w:val="16"/>
+              </w:rPr>
+              <w:t xml:space="preserve">Diperiksa oleh</w:t>
+            </w:r>
+          </w:p>
+        </w:tc>
+        <w:tc>
+          <w:tcPr>
+            <w:tcW w:w="3260" w:type="dxa"/>
+            <w:shd w:fill="DCE6F1"/>
+          </w:tcPr>
+          <w:p>
+            <w:pPr>
+              <w:spacing w:after="60" w:line="230" w:lineRule="auto"/>
+            </w:pPr>
+            <w:r>
+              <w:rPr>
+                <w:b/>
+                <w:sz w:val="16"/>
+              </w:rPr>
+              <w:t xml:space="preserve">Disetujui oleh</w:t>
+            </w:r>
+          </w:p>
+        </w:tc>
+      </w:tr>
+      <w:tr>
+        <w:tc>
+          <w:tcPr>
+            <w:tcW w:w="3260" w:type="dxa"/>
+          </w:tcPr>
+          <w:p>
+            <w:pPr>
+              <w:spacing w:after="60" w:line="230" w:lineRule="auto"/>
+            </w:pPr>
+            <w:r>
+              <w:rPr>
+                <w:sz w:val="16"/>
+              </w:rPr>
+              <w:t xml:space="preserve">Nama/Jabatan: __________________
+Tanggal: ______________</w:t>
+            </w:r>
+          </w:p>
+        </w:tc>
+        <w:tc>
+          <w:tcPr>
+            <w:tcW w:w="3260" w:type="dxa"/>
+          </w:tcPr>
+          <w:p>
+            <w:pPr>
+              <w:spacing w:after="60" w:line="230" w:lineRule="auto"/>
+            </w:pPr>
+            <w:r>
+              <w:rPr>
+                <w:sz w:val="16"/>
+              </w:rPr>
+              <w:t xml:space="preserve">Kepala Quality / Pemilik Proses
+Nama: __________________
+Tanggal: ______________</w:t>
+            </w:r>
+          </w:p>
+        </w:tc>
+        <w:tc>
+          <w:tcPr>
+            <w:tcW w:w="3260" w:type="dxa"/>
+          </w:tcPr>
+          <w:p>
+            <w:pPr>
+              <w:spacing w:after="60" w:line="230" w:lineRule="auto"/>
+            </w:pPr>
+            <w:r>
+              <w:rPr>
+                <w:sz w:val="16"/>
+              </w:rPr>
+              <w:t xml:space="preserve">Manajemen/Pejabat berwenang
+Nama: __________________
+Tanggal: ______________</w:t>
+            </w:r>
+          </w:p>
+        </w:tc>
+      </w:tr>
+    </w:tbl>
     <w:sectPr>
-      <w:headerReference w:type="default" r:id="rId2"/>
-      <w:footerReference w:type="default" r:id="rId3"/>
+      <w:headerReference w:type="default" ns1:id="rId2"/>
+      <w:footerReference w:type="default" ns1:id="rId3"/>
       <w:pgSz w:w="11906" w:h="16838"/>
       <w:pgMar w:top="1200" w:right="1050" w:bottom="1050" w:left="1050" w:header="500" w:footer="500" w:gutter="0"/>
       <w:cols w:space="708"/>

</xml_diff>